<commit_message>
Dodaj pobieranie certyfikatów, panel pytań i napraw szablon informacja-kpp
- Backend: endpoint i widok do generowania certyfikatu uczestnika (certyfikat.docx)
- Admin: przycisk "Certyfikat" przy każdym uczestniku w tabeli zapisów
- Panel uczestnika: karta "Pytania" z QuizPanel (nauka i egzamin próbny)
- Napraw {{created_at}} w szablonie informacja-kpp.docx (Word rozbił tag na 3 runy XML)

Co-Authored-By: Claude Sonnet 4.6 <noreply@anthropic.com>
</commit_message>
<xml_diff>
--- a/backend/documents/templates/informacja-kpp.docx
+++ b/backend/documents/templates/informacja-kpp.docx
@@ -13,15 +13,7 @@
         <w:t xml:space="preserve"> </w:t>
       </w:r>
       <w:r>
-        <w:t>{{</w:t>
-      </w:r>
-      <w:proofErr w:type="spellStart"/>
-      <w:r>
-        <w:t>created_at</w:t>
-      </w:r>
-      <w:proofErr w:type="spellEnd"/>
-      <w:r>
-        <w:t>}}</w:t>
+        <w:t>{{created_at}}</w:t>
       </w:r>
     </w:p>
     <w:p>

</xml_diff>